<commit_message>
Created the ZahraTableMaker API , but still needs working on.
</commit_message>
<xml_diff>
--- a/ZAHRA Editable CV.docx
+++ b/ZAHRA Editable CV.docx
@@ -75,25 +75,7 @@
             <w:sz w:val="20"/>
             <w:szCs w:val="20"/>
           </w:rPr>
-          <w:t>zahra.shefa.</w:t>
-        </w:r>
-        <w:bookmarkStart w:id="0" w:name="_GoBack"/>
-        <w:bookmarkEnd w:id="0"/>
-        <w:r>
-          <w:rPr>
-            <w:rStyle w:val="Hyperlink"/>
-            <w:sz w:val="20"/>
-            <w:szCs w:val="20"/>
-          </w:rPr>
-          <w:t>1</w:t>
-        </w:r>
-        <w:r>
-          <w:rPr>
-            <w:rStyle w:val="Hyperlink"/>
-            <w:sz w:val="20"/>
-            <w:szCs w:val="20"/>
-          </w:rPr>
-          <w:t>990@gmail.com</w:t>
+          <w:t>zahra.shefa.1990@gmail.com</w:t>
         </w:r>
       </w:hyperlink>
       <w:proofErr w:type="gramStart"/>
@@ -141,39 +123,7 @@
             <w:sz w:val="20"/>
             <w:szCs w:val="20"/>
           </w:rPr>
-          <w:t>Lin</w:t>
-        </w:r>
-        <w:r>
-          <w:rPr>
-            <w:rStyle w:val="Hyperlink"/>
-            <w:sz w:val="20"/>
-            <w:szCs w:val="20"/>
-          </w:rPr>
-          <w:t>k</w:t>
-        </w:r>
-        <w:r>
-          <w:rPr>
-            <w:rStyle w:val="Hyperlink"/>
-            <w:sz w:val="20"/>
-            <w:szCs w:val="20"/>
-          </w:rPr>
-          <w:t>ed</w:t>
-        </w:r>
-        <w:r>
-          <w:rPr>
-            <w:rStyle w:val="Hyperlink"/>
-            <w:sz w:val="20"/>
-            <w:szCs w:val="20"/>
-          </w:rPr>
-          <w:t>I</w:t>
-        </w:r>
-        <w:r>
-          <w:rPr>
-            <w:rStyle w:val="Hyperlink"/>
-            <w:sz w:val="20"/>
-            <w:szCs w:val="20"/>
-          </w:rPr>
-          <w:t>n</w:t>
+          <w:t>LinkedIn</w:t>
         </w:r>
       </w:hyperlink>
       <w:proofErr w:type="gramStart"/>
@@ -199,23 +149,7 @@
             <w:sz w:val="20"/>
             <w:szCs w:val="20"/>
           </w:rPr>
-          <w:t>Git</w:t>
-        </w:r>
-        <w:r>
-          <w:rPr>
-            <w:rStyle w:val="Hyperlink"/>
-            <w:sz w:val="20"/>
-            <w:szCs w:val="20"/>
-          </w:rPr>
-          <w:t>H</w:t>
-        </w:r>
-        <w:r>
-          <w:rPr>
-            <w:rStyle w:val="Hyperlink"/>
-            <w:sz w:val="20"/>
-            <w:szCs w:val="20"/>
-          </w:rPr>
-          <w:t>ub</w:t>
+          <w:t>GitHub</w:t>
         </w:r>
       </w:hyperlink>
       <w:proofErr w:type="gramStart"/>
@@ -255,853 +189,846 @@
             <w:sz w:val="20"/>
             <w:szCs w:val="20"/>
           </w:rPr>
-          <w:t>W</w:t>
+          <w:t>Website</w:t>
         </w:r>
+      </w:hyperlink>
+    </w:p>
+    <w:p>
+      <w:pPr>
+        <w:pStyle w:val="NormalWeb"/>
+        <w:tabs>
+          <w:tab w:val="left" w:pos="2500"/>
+        </w:tabs>
+        <w:spacing w:before="0" w:beforeAutospacing="0" w:after="0" w:afterAutospacing="0"/>
+        <w:rPr>
+          <w:sz w:val="20"/>
+          <w:szCs w:val="20"/>
+        </w:rPr>
+      </w:pPr>
+      <w:r>
+        <w:rPr>
+          <w:sz w:val="20"/>
+          <w:szCs w:val="20"/>
+        </w:rPr>
+        <w:tab/>
+      </w:r>
+    </w:p>
+    <w:p>
+      <w:pPr>
+        <w:pStyle w:val="NormalWeb"/>
+        <w:spacing w:before="0" w:beforeAutospacing="0" w:after="0" w:afterAutospacing="0"/>
+        <w:rPr>
+          <w:b/>
+          <w:bCs/>
+          <w:sz w:val="20"/>
+          <w:szCs w:val="20"/>
+        </w:rPr>
+      </w:pPr>
+      <w:r>
+        <w:rPr>
+          <w:b/>
+          <w:bCs/>
+          <w:sz w:val="20"/>
+          <w:szCs w:val="20"/>
+        </w:rPr>
+        <w:t xml:space="preserve">PROFESSIONAL SUMMARY </w:t>
+      </w:r>
+    </w:p>
+    <w:p>
+      <w:pPr>
+        <w:pStyle w:val="NormalWeb"/>
+        <w:spacing w:before="0" w:beforeAutospacing="0" w:after="0" w:afterAutospacing="0"/>
+      </w:pPr>
+      <w:r>
+        <w:t>Full-stack engineer specializing in building scalable, secure web applications with clear, maintainable code. Expert at aligning architecture with business needs and fostering collaboration in agile, feedback-driven teams.</w:t>
+      </w:r>
+    </w:p>
+    <w:p>
+      <w:pPr>
+        <w:pStyle w:val="NormalWeb"/>
+        <w:spacing w:before="0" w:beforeAutospacing="0" w:after="0" w:afterAutospacing="0"/>
+        <w:rPr>
+          <w:sz w:val="20"/>
+          <w:szCs w:val="20"/>
+        </w:rPr>
+      </w:pPr>
+    </w:p>
+    <w:p>
+      <w:pPr>
+        <w:pStyle w:val="NormalWeb"/>
+        <w:spacing w:before="0" w:beforeAutospacing="0" w:after="0" w:afterAutospacing="0"/>
+        <w:rPr>
+          <w:b/>
+          <w:bCs/>
+          <w:sz w:val="20"/>
+          <w:szCs w:val="20"/>
+        </w:rPr>
+      </w:pPr>
+      <w:r>
+        <w:rPr>
+          <w:b/>
+          <w:bCs/>
+          <w:sz w:val="20"/>
+          <w:szCs w:val="20"/>
+        </w:rPr>
+        <w:t xml:space="preserve">TECHNICAL SKILLS </w:t>
+      </w:r>
+    </w:p>
+    <w:p>
+      <w:pPr>
+        <w:pStyle w:val="NormalWeb"/>
+        <w:spacing w:before="0" w:beforeAutospacing="0" w:after="0" w:afterAutospacing="0"/>
+        <w:rPr>
+          <w:b/>
+          <w:bCs/>
+          <w:sz w:val="20"/>
+          <w:szCs w:val="20"/>
+        </w:rPr>
+      </w:pPr>
+      <w:r>
+        <w:rPr>
+          <w:rStyle w:val="Strong"/>
+          <w:sz w:val="20"/>
+          <w:szCs w:val="20"/>
+        </w:rPr>
+        <w:t>Languages &amp; Frameworks:</w:t>
+      </w:r>
+      <w:r>
+        <w:rPr>
+          <w:sz w:val="20"/>
+          <w:szCs w:val="20"/>
+        </w:rPr>
+        <w:t xml:space="preserve"> </w:t>
+      </w:r>
+      <w:r>
+        <w:rPr>
+          <w:sz w:val="20"/>
+          <w:szCs w:val="20"/>
+        </w:rPr>
+        <w:t xml:space="preserve">Python (Flask, </w:t>
+      </w:r>
+      <w:proofErr w:type="spellStart"/>
+      <w:r>
+        <w:rPr>
+          <w:sz w:val="20"/>
+          <w:szCs w:val="20"/>
+        </w:rPr>
+        <w:t>FastAPI</w:t>
+      </w:r>
+      <w:proofErr w:type="spellEnd"/>
+      <w:r>
+        <w:rPr>
+          <w:sz w:val="20"/>
+          <w:szCs w:val="20"/>
+        </w:rPr>
+        <w:t xml:space="preserve">, </w:t>
+      </w:r>
+      <w:proofErr w:type="spellStart"/>
+      <w:r>
+        <w:rPr>
+          <w:sz w:val="20"/>
+          <w:szCs w:val="20"/>
+        </w:rPr>
+        <w:t>Tkinter</w:t>
+      </w:r>
+      <w:proofErr w:type="spellEnd"/>
+      <w:r>
+        <w:rPr>
+          <w:sz w:val="20"/>
+          <w:szCs w:val="20"/>
+        </w:rPr>
+        <w:t>), PHP (</w:t>
+      </w:r>
+      <w:proofErr w:type="spellStart"/>
+      <w:r>
+        <w:rPr>
+          <w:sz w:val="20"/>
+          <w:szCs w:val="20"/>
+        </w:rPr>
+        <w:t>Laravel</w:t>
+      </w:r>
+      <w:proofErr w:type="spellEnd"/>
+      <w:r>
+        <w:rPr>
+          <w:sz w:val="20"/>
+          <w:szCs w:val="20"/>
+        </w:rPr>
+        <w:t>), JavaScript (React), HTML/CSS</w:t>
+      </w:r>
+    </w:p>
+    <w:p>
+      <w:pPr>
+        <w:pStyle w:val="NormalWeb"/>
+        <w:spacing w:before="0" w:beforeAutospacing="0" w:after="0" w:afterAutospacing="0"/>
+        <w:rPr>
+          <w:b/>
+          <w:bCs/>
+          <w:sz w:val="20"/>
+          <w:szCs w:val="20"/>
+        </w:rPr>
+      </w:pPr>
+      <w:r>
+        <w:rPr>
+          <w:rStyle w:val="Strong"/>
+          <w:sz w:val="20"/>
+          <w:szCs w:val="20"/>
+        </w:rPr>
+        <w:t>Data &amp; Storage:</w:t>
+      </w:r>
+      <w:r>
+        <w:rPr>
+          <w:sz w:val="20"/>
+          <w:szCs w:val="20"/>
+        </w:rPr>
+        <w:t xml:space="preserve"> </w:t>
+      </w:r>
+      <w:r>
+        <w:rPr>
+          <w:sz w:val="20"/>
+          <w:szCs w:val="20"/>
+        </w:rPr>
+        <w:t xml:space="preserve">MySQL, </w:t>
+      </w:r>
+      <w:proofErr w:type="spellStart"/>
+      <w:r>
+        <w:rPr>
+          <w:sz w:val="20"/>
+          <w:szCs w:val="20"/>
+        </w:rPr>
+        <w:t>SQLAlchemy</w:t>
+      </w:r>
+      <w:proofErr w:type="spellEnd"/>
+      <w:r>
+        <w:rPr>
+          <w:sz w:val="20"/>
+          <w:szCs w:val="20"/>
+        </w:rPr>
+        <w:t>, Eloquent ORM, file I/O, database normalization (3NF), ER diagramming</w:t>
+      </w:r>
+    </w:p>
+    <w:p>
+      <w:pPr>
+        <w:pStyle w:val="NormalWeb"/>
+        <w:spacing w:before="0" w:beforeAutospacing="0" w:after="0" w:afterAutospacing="0"/>
+        <w:rPr>
+          <w:b/>
+          <w:bCs/>
+          <w:sz w:val="20"/>
+          <w:szCs w:val="20"/>
+        </w:rPr>
+      </w:pPr>
+      <w:r>
+        <w:rPr>
+          <w:rStyle w:val="Strong"/>
+          <w:sz w:val="20"/>
+          <w:szCs w:val="20"/>
+        </w:rPr>
+        <w:t xml:space="preserve">Software Design &amp; </w:t>
+      </w:r>
+      <w:proofErr w:type="spellStart"/>
+      <w:r>
+        <w:rPr>
+          <w:rStyle w:val="Strong"/>
+          <w:sz w:val="20"/>
+          <w:szCs w:val="20"/>
+        </w:rPr>
+        <w:t>Practices:</w:t>
+      </w:r>
+      <w:r>
+        <w:rPr>
+          <w:sz w:val="20"/>
+          <w:szCs w:val="20"/>
+        </w:rPr>
+        <w:t>Object-oriented</w:t>
+      </w:r>
+      <w:proofErr w:type="spellEnd"/>
+      <w:r>
+        <w:rPr>
+          <w:sz w:val="20"/>
+          <w:szCs w:val="20"/>
+        </w:rPr>
+        <w:t xml:space="preserve"> design, modularization, reusable/concise coding, documentation (</w:t>
+      </w:r>
+      <w:proofErr w:type="spellStart"/>
+      <w:r>
+        <w:rPr>
+          <w:sz w:val="20"/>
+          <w:szCs w:val="20"/>
+        </w:rPr>
+        <w:t>docstrings</w:t>
+      </w:r>
+      <w:proofErr w:type="spellEnd"/>
+      <w:r>
+        <w:rPr>
+          <w:sz w:val="20"/>
+          <w:szCs w:val="20"/>
+        </w:rPr>
+        <w:t>), code clarity</w:t>
+      </w:r>
+    </w:p>
+    <w:p>
+      <w:pPr>
+        <w:pStyle w:val="NormalWeb"/>
+        <w:spacing w:before="0" w:beforeAutospacing="0" w:after="0" w:afterAutospacing="0"/>
+        <w:rPr>
+          <w:b/>
+          <w:bCs/>
+          <w:sz w:val="20"/>
+          <w:szCs w:val="20"/>
+        </w:rPr>
+      </w:pPr>
+      <w:r>
+        <w:rPr>
+          <w:rStyle w:val="Strong"/>
+          <w:sz w:val="20"/>
+          <w:szCs w:val="20"/>
+        </w:rPr>
+        <w:t xml:space="preserve">Tools &amp; </w:t>
+      </w:r>
+      <w:proofErr w:type="spellStart"/>
+      <w:r>
+        <w:rPr>
+          <w:rStyle w:val="Strong"/>
+          <w:sz w:val="20"/>
+          <w:szCs w:val="20"/>
+        </w:rPr>
+        <w:t>Methods:</w:t>
+      </w:r>
+      <w:r>
+        <w:rPr>
+          <w:sz w:val="20"/>
+          <w:szCs w:val="20"/>
+        </w:rPr>
+        <w:t>Git</w:t>
+      </w:r>
+      <w:proofErr w:type="spellEnd"/>
+      <w:r>
+        <w:rPr>
+          <w:sz w:val="20"/>
+          <w:szCs w:val="20"/>
+        </w:rPr>
+        <w:t>, REST APIs, authentication/encryption, unit testing, agile methodologies, server deployment</w:t>
+      </w:r>
+    </w:p>
+    <w:p>
+      <w:pPr>
+        <w:pStyle w:val="NormalWeb"/>
+        <w:spacing w:before="0" w:beforeAutospacing="0" w:after="0" w:afterAutospacing="0"/>
+        <w:rPr>
+          <w:b/>
+          <w:bCs/>
+          <w:sz w:val="20"/>
+          <w:szCs w:val="20"/>
+        </w:rPr>
+      </w:pPr>
+      <w:r>
+        <w:rPr>
+          <w:rStyle w:val="Strong"/>
+          <w:sz w:val="20"/>
+          <w:szCs w:val="20"/>
+        </w:rPr>
+        <w:t xml:space="preserve">Other Tools &amp; </w:t>
+      </w:r>
+      <w:proofErr w:type="spellStart"/>
+      <w:r>
+        <w:rPr>
+          <w:rStyle w:val="Strong"/>
+          <w:sz w:val="20"/>
+          <w:szCs w:val="20"/>
+        </w:rPr>
+        <w:t>Domains:</w:t>
+      </w:r>
+      <w:r>
+        <w:rPr>
+          <w:sz w:val="20"/>
+          <w:szCs w:val="20"/>
+        </w:rPr>
+        <w:t>Bootstrap</w:t>
+      </w:r>
+      <w:proofErr w:type="spellEnd"/>
+      <w:r>
+        <w:rPr>
+          <w:sz w:val="20"/>
+          <w:szCs w:val="20"/>
+        </w:rPr>
+        <w:t xml:space="preserve">, Unix, prompt engineering, </w:t>
+      </w:r>
+      <w:proofErr w:type="spellStart"/>
+      <w:r>
+        <w:rPr>
+          <w:sz w:val="20"/>
+          <w:szCs w:val="20"/>
+        </w:rPr>
+        <w:t>Figma</w:t>
+      </w:r>
+      <w:proofErr w:type="spellEnd"/>
+      <w:r>
+        <w:rPr>
+          <w:sz w:val="20"/>
+          <w:szCs w:val="20"/>
+        </w:rPr>
+        <w:t xml:space="preserve">, </w:t>
+      </w:r>
+      <w:proofErr w:type="spellStart"/>
+      <w:r>
+        <w:rPr>
+          <w:sz w:val="20"/>
+          <w:szCs w:val="20"/>
+        </w:rPr>
+        <w:t>Canva</w:t>
+      </w:r>
+      <w:proofErr w:type="spellEnd"/>
+      <w:r>
+        <w:rPr>
+          <w:sz w:val="20"/>
+          <w:szCs w:val="20"/>
+        </w:rPr>
+        <w:t>, Monday.com, MySQL Workbench, data analysis</w:t>
+      </w:r>
+    </w:p>
+    <w:p>
+      <w:pPr>
+        <w:pStyle w:val="NormalWeb"/>
+        <w:spacing w:before="0" w:beforeAutospacing="0" w:after="0" w:afterAutospacing="0"/>
+        <w:rPr>
+          <w:sz w:val="20"/>
+          <w:szCs w:val="20"/>
+        </w:rPr>
+      </w:pPr>
+      <w:r>
+        <w:rPr>
+          <w:rStyle w:val="Strong"/>
+          <w:sz w:val="20"/>
+          <w:szCs w:val="20"/>
+        </w:rPr>
+        <w:t xml:space="preserve">Interpersonal &amp; Team </w:t>
+      </w:r>
+      <w:proofErr w:type="spellStart"/>
+      <w:r>
+        <w:rPr>
+          <w:rStyle w:val="Strong"/>
+          <w:sz w:val="20"/>
+          <w:szCs w:val="20"/>
+        </w:rPr>
+        <w:t>Skills:</w:t>
+      </w:r>
+      <w:r>
+        <w:rPr>
+          <w:sz w:val="20"/>
+          <w:szCs w:val="20"/>
+        </w:rPr>
+        <w:t>Strong</w:t>
+      </w:r>
+      <w:proofErr w:type="spellEnd"/>
+      <w:r>
+        <w:rPr>
+          <w:sz w:val="20"/>
+          <w:szCs w:val="20"/>
+        </w:rPr>
+        <w:t xml:space="preserve"> collaborator, open to feedback, and proactive in offering positive, constructive suggestions</w:t>
+      </w:r>
+    </w:p>
+    <w:p>
+      <w:pPr>
+        <w:pStyle w:val="NormalWeb"/>
+        <w:spacing w:before="0" w:beforeAutospacing="0" w:after="0" w:afterAutospacing="0"/>
+        <w:rPr>
+          <w:b/>
+          <w:bCs/>
+          <w:sz w:val="20"/>
+          <w:szCs w:val="20"/>
+        </w:rPr>
+      </w:pPr>
+    </w:p>
+    <w:p>
+      <w:pPr>
+        <w:pStyle w:val="NormalWeb"/>
+        <w:spacing w:before="0" w:beforeAutospacing="0" w:after="0" w:afterAutospacing="0"/>
+        <w:rPr>
+          <w:b/>
+          <w:bCs/>
+          <w:sz w:val="20"/>
+          <w:szCs w:val="20"/>
+        </w:rPr>
+      </w:pPr>
+      <w:r>
+        <w:rPr>
+          <w:b/>
+          <w:bCs/>
+          <w:sz w:val="20"/>
+          <w:szCs w:val="20"/>
+        </w:rPr>
+        <w:t>PROJECTS</w:t>
+      </w:r>
+    </w:p>
+    <w:p>
+      <w:pPr>
+        <w:pStyle w:val="NormalWeb"/>
+        <w:spacing w:before="0" w:beforeAutospacing="0" w:after="0" w:afterAutospacing="0"/>
+        <w:rPr>
+          <w:b/>
+          <w:bCs/>
+          <w:sz w:val="20"/>
+          <w:szCs w:val="20"/>
+        </w:rPr>
+      </w:pPr>
+      <w:r>
+        <w:rPr>
+          <w:rStyle w:val="Strong"/>
+          <w:sz w:val="20"/>
+          <w:szCs w:val="20"/>
+        </w:rPr>
+        <w:t>The First Micro Finance Bank – Loan Management System</w:t>
+      </w:r>
+      <w:r>
+        <w:rPr>
+          <w:rStyle w:val="Strong"/>
+          <w:sz w:val="20"/>
+          <w:szCs w:val="20"/>
+        </w:rPr>
+        <w:t>|</w:t>
+      </w:r>
+      <w:r>
+        <w:rPr>
+          <w:sz w:val="20"/>
+          <w:szCs w:val="20"/>
+        </w:rPr>
+        <w:t xml:space="preserve"> </w:t>
+      </w:r>
+      <w:r>
+        <w:rPr>
+          <w:rStyle w:val="Strong"/>
+          <w:sz w:val="20"/>
+          <w:szCs w:val="20"/>
+        </w:rPr>
+        <w:t>Duration:</w:t>
+      </w:r>
+      <w:r>
+        <w:rPr>
+          <w:sz w:val="20"/>
+          <w:szCs w:val="20"/>
+        </w:rPr>
+        <w:t xml:space="preserve"> 3 Mon</w:t>
+      </w:r>
+      <w:r>
+        <w:rPr>
+          <w:sz w:val="20"/>
+          <w:szCs w:val="20"/>
+        </w:rPr>
+        <w:t>ths</w:t>
+      </w:r>
+      <w:r>
+        <w:rPr>
+          <w:sz w:val="20"/>
+          <w:szCs w:val="20"/>
+        </w:rPr>
+        <w:t xml:space="preserve"> | </w:t>
+      </w:r>
+      <w:hyperlink r:id="rId10" w:history="1">
         <w:r>
           <w:rPr>
             <w:rStyle w:val="Hyperlink"/>
             <w:sz w:val="20"/>
             <w:szCs w:val="20"/>
           </w:rPr>
-          <w:t>e</w:t>
+          <w:t>GitHub Repository Link</w:t>
         </w:r>
+      </w:hyperlink>
+    </w:p>
+    <w:p>
+      <w:pPr>
+        <w:spacing w:after="0" w:line="240" w:lineRule="auto"/>
+        <w:rPr>
+          <w:rFonts w:ascii="Times New Roman" w:eastAsia="Times New Roman" w:hAnsi="Times New Roman" w:cs="Times New Roman"/>
+          <w:sz w:val="20"/>
+          <w:szCs w:val="20"/>
+        </w:rPr>
+      </w:pPr>
+      <w:r>
+        <w:rPr>
+          <w:rFonts w:ascii="Times New Roman" w:eastAsia="Times New Roman" w:hAnsi="Symbol" w:cs="Times New Roman"/>
+          <w:sz w:val="20"/>
+          <w:szCs w:val="20"/>
+        </w:rPr>
+        <w:t xml:space="preserve">     </w:t>
+      </w:r>
+      <w:r>
+        <w:rPr>
+          <w:rFonts w:ascii="Times New Roman" w:eastAsia="Times New Roman" w:hAnsi="Symbol" w:cs="Times New Roman"/>
+          <w:sz w:val="20"/>
+          <w:szCs w:val="20"/>
+        </w:rPr>
+        <w:t xml:space="preserve"> </w:t>
+      </w:r>
+      <w:r>
+        <w:rPr>
+          <w:rFonts w:ascii="Times New Roman" w:eastAsia="Times New Roman" w:hAnsi="Symbol" w:cs="Times New Roman"/>
+          <w:sz w:val="20"/>
+          <w:szCs w:val="20"/>
+        </w:rPr>
+        <w:t></w:t>
+      </w:r>
+      <w:r>
+        <w:rPr>
+          <w:rFonts w:ascii="Times New Roman" w:eastAsia="Times New Roman" w:hAnsi="Times New Roman" w:cs="Times New Roman"/>
+          <w:sz w:val="20"/>
+          <w:szCs w:val="20"/>
+        </w:rPr>
+        <w:t xml:space="preserve">  </w:t>
+      </w:r>
+      <w:r>
+        <w:rPr>
+          <w:rFonts w:ascii="Times New Roman" w:eastAsia="Times New Roman" w:hAnsi="Times New Roman" w:cs="Times New Roman"/>
+          <w:sz w:val="20"/>
+          <w:szCs w:val="20"/>
+        </w:rPr>
+        <w:t xml:space="preserve">   </w:t>
+      </w:r>
+      <w:r>
+        <w:rPr>
+          <w:rFonts w:ascii="Times New Roman" w:eastAsia="Times New Roman" w:hAnsi="Times New Roman" w:cs="Times New Roman"/>
+          <w:sz w:val="20"/>
+          <w:szCs w:val="20"/>
+        </w:rPr>
+        <w:t>Built a full-automated loan processing system—eligibility rules, document management, workflows, scheduling.</w:t>
+      </w:r>
+    </w:p>
+    <w:p>
+      <w:pPr>
+        <w:spacing w:after="0" w:line="240" w:lineRule="auto"/>
+        <w:rPr>
+          <w:rFonts w:ascii="Times New Roman" w:eastAsia="Times New Roman" w:hAnsi="Times New Roman" w:cs="Times New Roman"/>
+          <w:sz w:val="20"/>
+          <w:szCs w:val="20"/>
+        </w:rPr>
+      </w:pPr>
+      <w:r>
+        <w:rPr>
+          <w:rFonts w:ascii="Times New Roman" w:eastAsia="Times New Roman" w:hAnsi="Symbol" w:cs="Times New Roman"/>
+          <w:sz w:val="20"/>
+          <w:szCs w:val="20"/>
+        </w:rPr>
+        <w:t xml:space="preserve">     </w:t>
+      </w:r>
+      <w:r>
+        <w:rPr>
+          <w:rFonts w:ascii="Times New Roman" w:eastAsia="Times New Roman" w:hAnsi="Symbol" w:cs="Times New Roman"/>
+          <w:sz w:val="20"/>
+          <w:szCs w:val="20"/>
+        </w:rPr>
+        <w:t xml:space="preserve"> </w:t>
+      </w:r>
+      <w:r>
+        <w:rPr>
+          <w:rFonts w:ascii="Times New Roman" w:eastAsia="Times New Roman" w:hAnsi="Symbol" w:cs="Times New Roman"/>
+          <w:sz w:val="20"/>
+          <w:szCs w:val="20"/>
+        </w:rPr>
+        <w:t></w:t>
+      </w:r>
+      <w:r>
+        <w:rPr>
+          <w:rFonts w:ascii="Times New Roman" w:eastAsia="Times New Roman" w:hAnsi="Times New Roman" w:cs="Times New Roman"/>
+          <w:sz w:val="20"/>
+          <w:szCs w:val="20"/>
+        </w:rPr>
+        <w:t xml:space="preserve">  </w:t>
+      </w:r>
+      <w:r>
+        <w:rPr>
+          <w:rFonts w:ascii="Times New Roman" w:eastAsia="Times New Roman" w:hAnsi="Times New Roman" w:cs="Times New Roman"/>
+          <w:sz w:val="20"/>
+          <w:szCs w:val="20"/>
+        </w:rPr>
+        <w:t xml:space="preserve">   </w:t>
+      </w:r>
+      <w:r>
+        <w:rPr>
+          <w:rFonts w:ascii="Times New Roman" w:eastAsia="Times New Roman" w:hAnsi="Times New Roman" w:cs="Times New Roman"/>
+          <w:sz w:val="20"/>
+          <w:szCs w:val="20"/>
+        </w:rPr>
+        <w:t>Used by microfinance institutions across loan officers, credit/risk, back office, branch staff.</w:t>
+      </w:r>
+    </w:p>
+    <w:p>
+      <w:pPr>
+        <w:spacing w:after="0" w:line="240" w:lineRule="auto"/>
+        <w:rPr>
+          <w:rFonts w:ascii="Times New Roman" w:eastAsia="Times New Roman" w:hAnsi="Times New Roman" w:cs="Times New Roman"/>
+          <w:sz w:val="20"/>
+          <w:szCs w:val="20"/>
+        </w:rPr>
+      </w:pPr>
+      <w:r>
+        <w:rPr>
+          <w:rFonts w:ascii="Times New Roman" w:eastAsia="Times New Roman" w:hAnsi="Symbol" w:cs="Times New Roman"/>
+          <w:sz w:val="20"/>
+          <w:szCs w:val="20"/>
+        </w:rPr>
+        <w:t xml:space="preserve">     </w:t>
+      </w:r>
+      <w:r>
+        <w:rPr>
+          <w:rFonts w:ascii="Times New Roman" w:eastAsia="Times New Roman" w:hAnsi="Symbol" w:cs="Times New Roman"/>
+          <w:sz w:val="20"/>
+          <w:szCs w:val="20"/>
+        </w:rPr>
+        <w:t xml:space="preserve"> </w:t>
+      </w:r>
+      <w:r>
+        <w:rPr>
+          <w:rFonts w:ascii="Times New Roman" w:eastAsia="Times New Roman" w:hAnsi="Symbol" w:cs="Times New Roman"/>
+          <w:sz w:val="20"/>
+          <w:szCs w:val="20"/>
+        </w:rPr>
+        <w:t></w:t>
+      </w:r>
+      <w:r>
+        <w:rPr>
+          <w:rFonts w:ascii="Times New Roman" w:eastAsia="Times New Roman" w:hAnsi="Times New Roman" w:cs="Times New Roman"/>
+          <w:sz w:val="20"/>
+          <w:szCs w:val="20"/>
+        </w:rPr>
+        <w:t xml:space="preserve">     </w:t>
+      </w:r>
+      <w:r>
+        <w:rPr>
+          <w:rFonts w:ascii="Times New Roman" w:eastAsia="Times New Roman" w:hAnsi="Times New Roman" w:cs="Times New Roman"/>
+          <w:sz w:val="20"/>
+          <w:szCs w:val="20"/>
+        </w:rPr>
+        <w:t>To remove manual bottlenecks, ensure consistent decisions, and cut errors/time.</w:t>
+      </w:r>
+    </w:p>
+    <w:p>
+      <w:pPr>
+        <w:spacing w:after="0" w:line="240" w:lineRule="auto"/>
+        <w:rPr>
+          <w:rFonts w:ascii="Times New Roman" w:eastAsia="Times New Roman" w:hAnsi="Times New Roman" w:cs="Times New Roman"/>
+          <w:sz w:val="24"/>
+          <w:szCs w:val="24"/>
+        </w:rPr>
+      </w:pPr>
+      <w:r>
+        <w:rPr>
+          <w:rFonts w:ascii="Times New Roman" w:eastAsia="Times New Roman" w:hAnsi="Symbol" w:cs="Times New Roman"/>
+          <w:sz w:val="20"/>
+          <w:szCs w:val="20"/>
+        </w:rPr>
+        <w:t xml:space="preserve">     </w:t>
+      </w:r>
+      <w:r>
+        <w:rPr>
+          <w:rFonts w:ascii="Times New Roman" w:eastAsia="Times New Roman" w:hAnsi="Symbol" w:cs="Times New Roman"/>
+          <w:sz w:val="20"/>
+          <w:szCs w:val="20"/>
+        </w:rPr>
+        <w:t xml:space="preserve"> </w:t>
+      </w:r>
+      <w:r>
+        <w:rPr>
+          <w:rFonts w:ascii="Times New Roman" w:eastAsia="Times New Roman" w:hAnsi="Symbol" w:cs="Times New Roman"/>
+          <w:sz w:val="20"/>
+          <w:szCs w:val="20"/>
+        </w:rPr>
+        <w:t></w:t>
+      </w:r>
+      <w:r>
+        <w:rPr>
+          <w:rFonts w:ascii="Times New Roman" w:eastAsia="Times New Roman" w:hAnsi="Times New Roman" w:cs="Times New Roman"/>
+          <w:sz w:val="20"/>
+          <w:szCs w:val="20"/>
+        </w:rPr>
+        <w:t xml:space="preserve">     </w:t>
+      </w:r>
+      <w:r>
+        <w:rPr>
+          <w:rFonts w:ascii="Times New Roman" w:eastAsia="Times New Roman" w:hAnsi="Times New Roman" w:cs="Times New Roman"/>
+          <w:sz w:val="20"/>
+          <w:szCs w:val="20"/>
+        </w:rPr>
+        <w:t>Boosted staff productivity ~40%, slashed processing time, and improved traceability with audit logs and document capture.</w:t>
+      </w:r>
+    </w:p>
+    <w:p>
+      <w:pPr>
+        <w:pStyle w:val="NormalWeb"/>
+        <w:spacing w:before="0" w:beforeAutospacing="0" w:after="0" w:afterAutospacing="0"/>
+        <w:rPr>
+          <w:b/>
+          <w:bCs/>
+          <w:sz w:val="20"/>
+          <w:szCs w:val="20"/>
+        </w:rPr>
+      </w:pPr>
+      <w:proofErr w:type="spellStart"/>
+      <w:r>
+        <w:rPr>
+          <w:rStyle w:val="Strong"/>
+          <w:sz w:val="20"/>
+          <w:szCs w:val="20"/>
+        </w:rPr>
+        <w:t>SecureCalc</w:t>
+      </w:r>
+      <w:proofErr w:type="spellEnd"/>
+      <w:r>
+        <w:rPr>
+          <w:rStyle w:val="Strong"/>
+          <w:sz w:val="20"/>
+          <w:szCs w:val="20"/>
+        </w:rPr>
+        <w:t xml:space="preserve"> (Flask, OOP / Modular Design</w:t>
+      </w:r>
+      <w:r>
+        <w:rPr>
+          <w:rStyle w:val="Strong"/>
+          <w:sz w:val="20"/>
+          <w:szCs w:val="20"/>
+        </w:rPr>
+        <w:t xml:space="preserve"> |Duration: 1 M</w:t>
+      </w:r>
+      <w:r>
+        <w:rPr>
+          <w:rStyle w:val="Strong"/>
+          <w:sz w:val="20"/>
+          <w:szCs w:val="20"/>
+        </w:rPr>
+        <w:t>onth</w:t>
+      </w:r>
+      <w:r>
+        <w:rPr>
+          <w:rStyle w:val="Strong"/>
+          <w:sz w:val="20"/>
+          <w:szCs w:val="20"/>
+        </w:rPr>
+        <w:t xml:space="preserve"> |</w:t>
+      </w:r>
+      <w:r>
+        <w:rPr>
+          <w:rStyle w:val="Strong"/>
+          <w:sz w:val="20"/>
+          <w:szCs w:val="20"/>
+        </w:rPr>
+        <w:t xml:space="preserve"> </w:t>
+      </w:r>
+      <w:hyperlink r:id="rId11" w:history="1">
         <w:r>
           <w:rPr>
             <w:rStyle w:val="Hyperlink"/>
             <w:sz w:val="20"/>
             <w:szCs w:val="20"/>
           </w:rPr>
-          <w:t>bsite</w:t>
+          <w:t>GitHub Repository Link</w:t>
         </w:r>
       </w:hyperlink>
     </w:p>
     <w:p>
       <w:pPr>
-        <w:pStyle w:val="NormalWeb"/>
-        <w:tabs>
-          <w:tab w:val="left" w:pos="2500"/>
-        </w:tabs>
-        <w:spacing w:before="0" w:beforeAutospacing="0" w:after="0" w:afterAutospacing="0"/>
-        <w:rPr>
-          <w:sz w:val="20"/>
-          <w:szCs w:val="20"/>
-        </w:rPr>
-      </w:pPr>
-      <w:r>
-        <w:rPr>
-          <w:sz w:val="20"/>
-          <w:szCs w:val="20"/>
-        </w:rPr>
-        <w:tab/>
-      </w:r>
-    </w:p>
-    <w:p>
-      <w:pPr>
-        <w:pStyle w:val="NormalWeb"/>
-        <w:spacing w:before="0" w:beforeAutospacing="0" w:after="0" w:afterAutospacing="0"/>
-        <w:rPr>
-          <w:b/>
-          <w:bCs/>
-          <w:sz w:val="20"/>
-          <w:szCs w:val="20"/>
-        </w:rPr>
-      </w:pPr>
-      <w:r>
-        <w:rPr>
-          <w:b/>
-          <w:bCs/>
-          <w:sz w:val="20"/>
-          <w:szCs w:val="20"/>
-        </w:rPr>
-        <w:t xml:space="preserve">PROFESSIONAL SUMMARY </w:t>
-      </w:r>
-    </w:p>
-    <w:p>
-      <w:pPr>
-        <w:pStyle w:val="NormalWeb"/>
-        <w:spacing w:before="0" w:beforeAutospacing="0" w:after="0" w:afterAutospacing="0"/>
-        <w:rPr>
-          <w:sz w:val="20"/>
-          <w:szCs w:val="20"/>
-        </w:rPr>
-      </w:pPr>
-      <w:proofErr w:type="gramStart"/>
-      <w:r>
-        <w:t>Full-stack engineer specializing in building scalable, secure web applications with clear, maintainable code.</w:t>
-      </w:r>
-      <w:proofErr w:type="gramEnd"/>
-      <w:r>
-        <w:t xml:space="preserve"> Expert at aligning architecture with business needs and fostering collaboration in agile, feedback-driven teams.</w:t>
-      </w:r>
-    </w:p>
-    <w:p>
-      <w:pPr>
-        <w:pStyle w:val="NormalWeb"/>
-        <w:spacing w:before="0" w:beforeAutospacing="0" w:after="0" w:afterAutospacing="0"/>
-        <w:rPr>
-          <w:b/>
-          <w:bCs/>
-          <w:sz w:val="20"/>
-          <w:szCs w:val="20"/>
-        </w:rPr>
-      </w:pPr>
-      <w:r>
-        <w:rPr>
-          <w:b/>
-          <w:bCs/>
-          <w:sz w:val="20"/>
-          <w:szCs w:val="20"/>
-        </w:rPr>
-        <w:t xml:space="preserve">TECHNICAL SKILLS </w:t>
-      </w:r>
-    </w:p>
-    <w:p>
-      <w:pPr>
-        <w:pStyle w:val="NormalWeb"/>
-        <w:spacing w:before="0" w:beforeAutospacing="0" w:after="0" w:afterAutospacing="0"/>
-        <w:rPr>
-          <w:b/>
-          <w:bCs/>
-          <w:sz w:val="20"/>
-          <w:szCs w:val="20"/>
-        </w:rPr>
-      </w:pPr>
-      <w:r>
-        <w:rPr>
-          <w:rStyle w:val="Strong"/>
-          <w:sz w:val="20"/>
-          <w:szCs w:val="20"/>
-        </w:rPr>
-        <w:t>Languages &amp; Frameworks:</w:t>
-      </w:r>
-      <w:r>
-        <w:rPr>
-          <w:sz w:val="20"/>
-          <w:szCs w:val="20"/>
-        </w:rPr>
-        <w:t xml:space="preserve"> </w:t>
-      </w:r>
-      <w:r>
-        <w:rPr>
-          <w:sz w:val="20"/>
-          <w:szCs w:val="20"/>
-        </w:rPr>
-        <w:t xml:space="preserve">Python (Flask, </w:t>
-      </w:r>
-      <w:proofErr w:type="spellStart"/>
-      <w:r>
-        <w:rPr>
-          <w:sz w:val="20"/>
-          <w:szCs w:val="20"/>
-        </w:rPr>
-        <w:t>FastAPI</w:t>
-      </w:r>
-      <w:proofErr w:type="spellEnd"/>
-      <w:r>
-        <w:rPr>
-          <w:sz w:val="20"/>
-          <w:szCs w:val="20"/>
-        </w:rPr>
-        <w:t xml:space="preserve">, </w:t>
-      </w:r>
-      <w:proofErr w:type="spellStart"/>
-      <w:r>
-        <w:rPr>
-          <w:sz w:val="20"/>
-          <w:szCs w:val="20"/>
-        </w:rPr>
-        <w:t>Tkinter</w:t>
-      </w:r>
-      <w:proofErr w:type="spellEnd"/>
-      <w:r>
-        <w:rPr>
-          <w:sz w:val="20"/>
-          <w:szCs w:val="20"/>
-        </w:rPr>
-        <w:t>), PHP (</w:t>
-      </w:r>
-      <w:proofErr w:type="spellStart"/>
-      <w:r>
-        <w:rPr>
-          <w:sz w:val="20"/>
-          <w:szCs w:val="20"/>
-        </w:rPr>
-        <w:t>Laravel</w:t>
-      </w:r>
-      <w:proofErr w:type="spellEnd"/>
-      <w:r>
-        <w:rPr>
-          <w:sz w:val="20"/>
-          <w:szCs w:val="20"/>
-        </w:rPr>
-        <w:t>), JavaScript (React), HTML/CSS</w:t>
-      </w:r>
-    </w:p>
-    <w:p>
-      <w:pPr>
-        <w:pStyle w:val="NormalWeb"/>
-        <w:spacing w:before="0" w:beforeAutospacing="0" w:after="0" w:afterAutospacing="0"/>
-        <w:rPr>
-          <w:b/>
-          <w:bCs/>
-          <w:sz w:val="20"/>
-          <w:szCs w:val="20"/>
-        </w:rPr>
-      </w:pPr>
-      <w:r>
-        <w:rPr>
-          <w:rStyle w:val="Strong"/>
-          <w:sz w:val="20"/>
-          <w:szCs w:val="20"/>
-        </w:rPr>
-        <w:t>Data &amp; Storage:</w:t>
-      </w:r>
-      <w:r>
-        <w:rPr>
-          <w:sz w:val="20"/>
-          <w:szCs w:val="20"/>
-        </w:rPr>
-        <w:t xml:space="preserve"> </w:t>
-      </w:r>
-      <w:r>
-        <w:rPr>
-          <w:sz w:val="20"/>
-          <w:szCs w:val="20"/>
-        </w:rPr>
-        <w:t xml:space="preserve">MySQL, </w:t>
-      </w:r>
-      <w:proofErr w:type="spellStart"/>
-      <w:r>
-        <w:rPr>
-          <w:sz w:val="20"/>
-          <w:szCs w:val="20"/>
-        </w:rPr>
-        <w:t>SQLAlchemy</w:t>
-      </w:r>
-      <w:proofErr w:type="spellEnd"/>
-      <w:r>
-        <w:rPr>
-          <w:sz w:val="20"/>
-          <w:szCs w:val="20"/>
-        </w:rPr>
-        <w:t>, Eloquent ORM, file I/O, database normalization (3NF), ER diagramming</w:t>
-      </w:r>
-    </w:p>
-    <w:p>
-      <w:pPr>
-        <w:pStyle w:val="NormalWeb"/>
-        <w:spacing w:before="0" w:beforeAutospacing="0" w:after="0" w:afterAutospacing="0"/>
-        <w:rPr>
-          <w:b/>
-          <w:bCs/>
-          <w:sz w:val="20"/>
-          <w:szCs w:val="20"/>
-        </w:rPr>
-      </w:pPr>
-      <w:r>
-        <w:rPr>
-          <w:rStyle w:val="Strong"/>
-          <w:sz w:val="20"/>
-          <w:szCs w:val="20"/>
-        </w:rPr>
-        <w:t xml:space="preserve">Software Design &amp; </w:t>
-      </w:r>
-      <w:proofErr w:type="spellStart"/>
-      <w:r>
-        <w:rPr>
-          <w:rStyle w:val="Strong"/>
-          <w:sz w:val="20"/>
-          <w:szCs w:val="20"/>
-        </w:rPr>
-        <w:t>Practices</w:t>
-      </w:r>
-      <w:proofErr w:type="gramStart"/>
-      <w:r>
-        <w:rPr>
-          <w:rStyle w:val="Strong"/>
-          <w:sz w:val="20"/>
-          <w:szCs w:val="20"/>
-        </w:rPr>
-        <w:t>:</w:t>
-      </w:r>
-      <w:r>
-        <w:rPr>
-          <w:sz w:val="20"/>
-          <w:szCs w:val="20"/>
-        </w:rPr>
-        <w:t>Object</w:t>
-      </w:r>
-      <w:proofErr w:type="gramEnd"/>
-      <w:r>
-        <w:rPr>
-          <w:sz w:val="20"/>
-          <w:szCs w:val="20"/>
-        </w:rPr>
-        <w:t>-oriented</w:t>
-      </w:r>
-      <w:proofErr w:type="spellEnd"/>
-      <w:r>
-        <w:rPr>
-          <w:sz w:val="20"/>
-          <w:szCs w:val="20"/>
-        </w:rPr>
-        <w:t xml:space="preserve"> design, modularization, reusable/concise coding, documentation (</w:t>
-      </w:r>
-      <w:proofErr w:type="spellStart"/>
-      <w:r>
-        <w:rPr>
-          <w:sz w:val="20"/>
-          <w:szCs w:val="20"/>
-        </w:rPr>
-        <w:t>docstrings</w:t>
-      </w:r>
-      <w:proofErr w:type="spellEnd"/>
-      <w:r>
-        <w:rPr>
-          <w:sz w:val="20"/>
-          <w:szCs w:val="20"/>
-        </w:rPr>
-        <w:t>), code clarity</w:t>
-      </w:r>
-    </w:p>
-    <w:p>
-      <w:pPr>
-        <w:pStyle w:val="NormalWeb"/>
-        <w:spacing w:before="0" w:beforeAutospacing="0" w:after="0" w:afterAutospacing="0"/>
-        <w:rPr>
-          <w:b/>
-          <w:bCs/>
-          <w:sz w:val="20"/>
-          <w:szCs w:val="20"/>
-        </w:rPr>
-      </w:pPr>
-      <w:r>
-        <w:rPr>
-          <w:rStyle w:val="Strong"/>
-          <w:sz w:val="20"/>
-          <w:szCs w:val="20"/>
-        </w:rPr>
-        <w:t xml:space="preserve">Tools &amp; </w:t>
-      </w:r>
-      <w:proofErr w:type="spellStart"/>
-      <w:r>
-        <w:rPr>
-          <w:rStyle w:val="Strong"/>
-          <w:sz w:val="20"/>
-          <w:szCs w:val="20"/>
-        </w:rPr>
-        <w:t>Methods</w:t>
-      </w:r>
-      <w:proofErr w:type="gramStart"/>
-      <w:r>
-        <w:rPr>
-          <w:rStyle w:val="Strong"/>
-          <w:sz w:val="20"/>
-          <w:szCs w:val="20"/>
-        </w:rPr>
-        <w:t>:</w:t>
-      </w:r>
-      <w:r>
-        <w:rPr>
-          <w:sz w:val="20"/>
-          <w:szCs w:val="20"/>
-        </w:rPr>
-        <w:t>Git</w:t>
-      </w:r>
-      <w:proofErr w:type="spellEnd"/>
-      <w:proofErr w:type="gramEnd"/>
-      <w:r>
-        <w:rPr>
-          <w:sz w:val="20"/>
-          <w:szCs w:val="20"/>
-        </w:rPr>
-        <w:t>, REST APIs, authentication/encryption, unit testing, agile methodologies, server deployment</w:t>
-      </w:r>
-    </w:p>
-    <w:p>
-      <w:pPr>
-        <w:pStyle w:val="NormalWeb"/>
-        <w:spacing w:before="0" w:beforeAutospacing="0" w:after="0" w:afterAutospacing="0"/>
-        <w:rPr>
-          <w:b/>
-          <w:bCs/>
-          <w:sz w:val="20"/>
-          <w:szCs w:val="20"/>
-        </w:rPr>
-      </w:pPr>
-      <w:r>
-        <w:rPr>
-          <w:rStyle w:val="Strong"/>
-          <w:sz w:val="20"/>
-          <w:szCs w:val="20"/>
-        </w:rPr>
-        <w:t xml:space="preserve">Other Tools &amp; </w:t>
-      </w:r>
-      <w:proofErr w:type="spellStart"/>
-      <w:r>
-        <w:rPr>
-          <w:rStyle w:val="Strong"/>
-          <w:sz w:val="20"/>
-          <w:szCs w:val="20"/>
-        </w:rPr>
-        <w:t>Domains</w:t>
-      </w:r>
-      <w:proofErr w:type="gramStart"/>
-      <w:r>
-        <w:rPr>
-          <w:rStyle w:val="Strong"/>
-          <w:sz w:val="20"/>
-          <w:szCs w:val="20"/>
-        </w:rPr>
-        <w:t>:</w:t>
-      </w:r>
-      <w:r>
-        <w:rPr>
-          <w:sz w:val="20"/>
-          <w:szCs w:val="20"/>
-        </w:rPr>
-        <w:t>Bootstrap</w:t>
-      </w:r>
-      <w:proofErr w:type="spellEnd"/>
-      <w:proofErr w:type="gramEnd"/>
-      <w:r>
-        <w:rPr>
-          <w:sz w:val="20"/>
-          <w:szCs w:val="20"/>
-        </w:rPr>
-        <w:t xml:space="preserve">, Unix, prompt engineering, </w:t>
-      </w:r>
-      <w:proofErr w:type="spellStart"/>
-      <w:r>
-        <w:rPr>
-          <w:sz w:val="20"/>
-          <w:szCs w:val="20"/>
-        </w:rPr>
-        <w:t>Figma</w:t>
-      </w:r>
-      <w:proofErr w:type="spellEnd"/>
-      <w:r>
-        <w:rPr>
-          <w:sz w:val="20"/>
-          <w:szCs w:val="20"/>
-        </w:rPr>
-        <w:t xml:space="preserve">, </w:t>
-      </w:r>
-      <w:proofErr w:type="spellStart"/>
-      <w:r>
-        <w:rPr>
-          <w:sz w:val="20"/>
-          <w:szCs w:val="20"/>
-        </w:rPr>
-        <w:t>Canva</w:t>
-      </w:r>
-      <w:proofErr w:type="spellEnd"/>
-      <w:r>
-        <w:rPr>
-          <w:sz w:val="20"/>
-          <w:szCs w:val="20"/>
-        </w:rPr>
-        <w:t>, Monday.com, MySQL Workbench, data analysis</w:t>
-      </w:r>
-    </w:p>
-    <w:p>
-      <w:pPr>
-        <w:pStyle w:val="NormalWeb"/>
-        <w:spacing w:before="0" w:beforeAutospacing="0" w:after="0" w:afterAutospacing="0"/>
-        <w:rPr>
-          <w:b/>
-          <w:bCs/>
-          <w:sz w:val="20"/>
-          <w:szCs w:val="20"/>
-        </w:rPr>
-      </w:pPr>
-      <w:r>
-        <w:rPr>
-          <w:rStyle w:val="Strong"/>
-          <w:sz w:val="20"/>
-          <w:szCs w:val="20"/>
-        </w:rPr>
-        <w:t xml:space="preserve">Interpersonal &amp; Team </w:t>
-      </w:r>
-      <w:proofErr w:type="spellStart"/>
-      <w:r>
-        <w:rPr>
-          <w:rStyle w:val="Strong"/>
-          <w:sz w:val="20"/>
-          <w:szCs w:val="20"/>
-        </w:rPr>
-        <w:t>Skills</w:t>
-      </w:r>
-      <w:proofErr w:type="gramStart"/>
-      <w:r>
-        <w:rPr>
-          <w:rStyle w:val="Strong"/>
-          <w:sz w:val="20"/>
-          <w:szCs w:val="20"/>
-        </w:rPr>
-        <w:t>:</w:t>
-      </w:r>
-      <w:r>
-        <w:rPr>
-          <w:sz w:val="20"/>
-          <w:szCs w:val="20"/>
-        </w:rPr>
-        <w:t>Strong</w:t>
-      </w:r>
-      <w:proofErr w:type="spellEnd"/>
-      <w:proofErr w:type="gramEnd"/>
-      <w:r>
-        <w:rPr>
-          <w:sz w:val="20"/>
-          <w:szCs w:val="20"/>
-        </w:rPr>
-        <w:t xml:space="preserve"> collaborator, open to feedback, and proactive in offering positive, constructive suggestions</w:t>
-      </w:r>
-    </w:p>
-    <w:p>
-      <w:pPr>
-        <w:pStyle w:val="NormalWeb"/>
-        <w:spacing w:before="0" w:beforeAutospacing="0" w:after="0" w:afterAutospacing="0"/>
-        <w:rPr>
-          <w:b/>
-          <w:bCs/>
-          <w:sz w:val="20"/>
-          <w:szCs w:val="20"/>
-        </w:rPr>
-      </w:pPr>
-      <w:r>
-        <w:rPr>
-          <w:b/>
-          <w:bCs/>
-          <w:sz w:val="20"/>
-          <w:szCs w:val="20"/>
-        </w:rPr>
-        <w:t>PROJECTS</w:t>
-      </w:r>
-    </w:p>
-    <w:p>
-      <w:pPr>
-        <w:pStyle w:val="NormalWeb"/>
-        <w:spacing w:before="0" w:beforeAutospacing="0" w:after="0" w:afterAutospacing="0"/>
-        <w:rPr>
-          <w:b/>
-          <w:bCs/>
-          <w:sz w:val="20"/>
-          <w:szCs w:val="20"/>
-        </w:rPr>
-      </w:pPr>
-      <w:r>
-        <w:rPr>
-          <w:rStyle w:val="Strong"/>
-          <w:sz w:val="20"/>
-          <w:szCs w:val="20"/>
-        </w:rPr>
-        <w:t>The First Micro Finance Bank – Loan Management System</w:t>
-      </w:r>
-      <w:r>
-        <w:rPr>
-          <w:rStyle w:val="Strong"/>
-          <w:sz w:val="20"/>
-          <w:szCs w:val="20"/>
-        </w:rPr>
-        <w:t>|</w:t>
-      </w:r>
-      <w:r>
-        <w:rPr>
-          <w:sz w:val="20"/>
-          <w:szCs w:val="20"/>
-        </w:rPr>
-        <w:t xml:space="preserve"> </w:t>
-      </w:r>
-      <w:r>
-        <w:rPr>
-          <w:rStyle w:val="Strong"/>
-          <w:sz w:val="20"/>
-          <w:szCs w:val="20"/>
-        </w:rPr>
-        <w:t>Duration:</w:t>
-      </w:r>
-      <w:r>
-        <w:rPr>
-          <w:sz w:val="20"/>
-          <w:szCs w:val="20"/>
-        </w:rPr>
-        <w:t xml:space="preserve"> 3 Mon</w:t>
-      </w:r>
-      <w:r>
-        <w:rPr>
-          <w:sz w:val="20"/>
-          <w:szCs w:val="20"/>
-        </w:rPr>
-        <w:t>ths</w:t>
-      </w:r>
-    </w:p>
-    <w:p>
-      <w:pPr>
-        <w:spacing w:after="0" w:line="240" w:lineRule="auto"/>
-        <w:rPr>
-          <w:rFonts w:ascii="Times New Roman" w:eastAsia="Times New Roman" w:hAnsi="Times New Roman" w:cs="Times New Roman"/>
-          <w:sz w:val="20"/>
-          <w:szCs w:val="20"/>
-        </w:rPr>
-      </w:pPr>
-      <w:r>
-        <w:rPr>
-          <w:rFonts w:ascii="Times New Roman" w:eastAsia="Times New Roman" w:hAnsi="Symbol" w:cs="Times New Roman"/>
-          <w:sz w:val="20"/>
-          <w:szCs w:val="20"/>
-        </w:rPr>
-        <w:t xml:space="preserve">   </w:t>
-      </w:r>
-      <w:r>
-        <w:rPr>
-          <w:rFonts w:ascii="Times New Roman" w:eastAsia="Times New Roman" w:hAnsi="Symbol" w:cs="Times New Roman"/>
-          <w:sz w:val="20"/>
-          <w:szCs w:val="20"/>
-        </w:rPr>
-        <w:tab/>
-      </w:r>
-      <w:r>
-        <w:rPr>
-          <w:rFonts w:ascii="Times New Roman" w:eastAsia="Times New Roman" w:hAnsi="Symbol" w:cs="Times New Roman"/>
-          <w:sz w:val="20"/>
-          <w:szCs w:val="20"/>
-        </w:rPr>
-        <w:t xml:space="preserve">      </w:t>
-      </w:r>
-      <w:r>
-        <w:rPr>
-          <w:rFonts w:ascii="Times New Roman" w:eastAsia="Times New Roman" w:hAnsi="Symbol" w:cs="Times New Roman"/>
-          <w:sz w:val="20"/>
-          <w:szCs w:val="20"/>
-        </w:rPr>
-        <w:t></w:t>
-      </w:r>
-      <w:r>
-        <w:rPr>
-          <w:rFonts w:ascii="Times New Roman" w:eastAsia="Times New Roman" w:hAnsi="Times New Roman" w:cs="Times New Roman"/>
-          <w:sz w:val="20"/>
-          <w:szCs w:val="20"/>
-        </w:rPr>
-        <w:t xml:space="preserve">  </w:t>
-      </w:r>
-      <w:r>
-        <w:rPr>
-          <w:rFonts w:ascii="Times New Roman" w:eastAsia="Times New Roman" w:hAnsi="Times New Roman" w:cs="Times New Roman"/>
-          <w:sz w:val="20"/>
-          <w:szCs w:val="20"/>
-        </w:rPr>
-        <w:t xml:space="preserve">   </w:t>
-      </w:r>
-      <w:r>
-        <w:rPr>
-          <w:rFonts w:ascii="Times New Roman" w:eastAsia="Times New Roman" w:hAnsi="Times New Roman" w:cs="Times New Roman"/>
-          <w:sz w:val="20"/>
-          <w:szCs w:val="20"/>
-        </w:rPr>
-        <w:t>Built a full-automated loan processing system—eligibility rules, document management, workflows, scheduling.</w:t>
-      </w:r>
-    </w:p>
-    <w:p>
-      <w:pPr>
-        <w:spacing w:after="0" w:line="240" w:lineRule="auto"/>
-        <w:ind w:left="720"/>
-        <w:rPr>
-          <w:rFonts w:ascii="Times New Roman" w:eastAsia="Times New Roman" w:hAnsi="Times New Roman" w:cs="Times New Roman"/>
-          <w:sz w:val="20"/>
-          <w:szCs w:val="20"/>
-        </w:rPr>
-      </w:pPr>
-      <w:r>
-        <w:rPr>
-          <w:rFonts w:ascii="Times New Roman" w:eastAsia="Times New Roman" w:hAnsi="Symbol" w:cs="Times New Roman"/>
-          <w:sz w:val="20"/>
-          <w:szCs w:val="20"/>
-        </w:rPr>
-        <w:t xml:space="preserve">      </w:t>
-      </w:r>
-      <w:proofErr w:type="gramStart"/>
-      <w:r>
-        <w:rPr>
-          <w:rFonts w:ascii="Times New Roman" w:eastAsia="Times New Roman" w:hAnsi="Symbol" w:cs="Times New Roman"/>
-          <w:sz w:val="20"/>
-          <w:szCs w:val="20"/>
-        </w:rPr>
-        <w:t></w:t>
-      </w:r>
-      <w:r>
-        <w:rPr>
-          <w:rFonts w:ascii="Times New Roman" w:eastAsia="Times New Roman" w:hAnsi="Times New Roman" w:cs="Times New Roman"/>
-          <w:sz w:val="20"/>
-          <w:szCs w:val="20"/>
-        </w:rPr>
-        <w:t xml:space="preserve">  </w:t>
-      </w:r>
-      <w:r>
-        <w:rPr>
-          <w:rFonts w:ascii="Times New Roman" w:eastAsia="Times New Roman" w:hAnsi="Times New Roman" w:cs="Times New Roman"/>
-          <w:sz w:val="20"/>
-          <w:szCs w:val="20"/>
-        </w:rPr>
-        <w:t xml:space="preserve">   </w:t>
-      </w:r>
-      <w:r>
-        <w:rPr>
-          <w:rFonts w:ascii="Times New Roman" w:eastAsia="Times New Roman" w:hAnsi="Times New Roman" w:cs="Times New Roman"/>
-          <w:sz w:val="20"/>
-          <w:szCs w:val="20"/>
-        </w:rPr>
-        <w:t>Used by microfinance institutions across loan officers, credit/risk, back office, branch staff.</w:t>
-      </w:r>
-      <w:proofErr w:type="gramEnd"/>
-    </w:p>
-    <w:p>
-      <w:pPr>
-        <w:spacing w:after="0" w:line="240" w:lineRule="auto"/>
-        <w:ind w:left="720"/>
-        <w:rPr>
-          <w:rFonts w:ascii="Times New Roman" w:eastAsia="Times New Roman" w:hAnsi="Times New Roman" w:cs="Times New Roman"/>
-          <w:sz w:val="20"/>
-          <w:szCs w:val="20"/>
-        </w:rPr>
-      </w:pPr>
-      <w:r>
-        <w:rPr>
-          <w:rFonts w:ascii="Times New Roman" w:eastAsia="Times New Roman" w:hAnsi="Symbol" w:cs="Times New Roman"/>
-          <w:sz w:val="20"/>
-          <w:szCs w:val="20"/>
-        </w:rPr>
-        <w:t xml:space="preserve">      </w:t>
-      </w:r>
-      <w:r>
-        <w:rPr>
-          <w:rFonts w:ascii="Times New Roman" w:eastAsia="Times New Roman" w:hAnsi="Symbol" w:cs="Times New Roman"/>
-          <w:sz w:val="20"/>
-          <w:szCs w:val="20"/>
-        </w:rPr>
-        <w:t></w:t>
-      </w:r>
-      <w:r>
-        <w:rPr>
-          <w:rFonts w:ascii="Times New Roman" w:eastAsia="Times New Roman" w:hAnsi="Times New Roman" w:cs="Times New Roman"/>
-          <w:sz w:val="20"/>
-          <w:szCs w:val="20"/>
-        </w:rPr>
-        <w:t xml:space="preserve">     </w:t>
-      </w:r>
-      <w:proofErr w:type="gramStart"/>
-      <w:r>
-        <w:rPr>
-          <w:rFonts w:ascii="Times New Roman" w:eastAsia="Times New Roman" w:hAnsi="Times New Roman" w:cs="Times New Roman"/>
-          <w:sz w:val="20"/>
-          <w:szCs w:val="20"/>
-        </w:rPr>
-        <w:t>To</w:t>
-      </w:r>
-      <w:proofErr w:type="gramEnd"/>
-      <w:r>
-        <w:rPr>
-          <w:rFonts w:ascii="Times New Roman" w:eastAsia="Times New Roman" w:hAnsi="Times New Roman" w:cs="Times New Roman"/>
-          <w:sz w:val="20"/>
-          <w:szCs w:val="20"/>
-        </w:rPr>
-        <w:t xml:space="preserve"> remove manual bottlenecks, ensure consistent decisions, and cut errors/time.</w:t>
-      </w:r>
-    </w:p>
-    <w:p>
-      <w:pPr>
-        <w:spacing w:after="0" w:line="240" w:lineRule="auto"/>
-        <w:ind w:left="720"/>
-        <w:rPr>
-          <w:rFonts w:ascii="Times New Roman" w:eastAsia="Times New Roman" w:hAnsi="Times New Roman" w:cs="Times New Roman"/>
-          <w:sz w:val="24"/>
-          <w:szCs w:val="24"/>
-        </w:rPr>
-      </w:pPr>
-      <w:r>
-        <w:rPr>
-          <w:rFonts w:ascii="Times New Roman" w:eastAsia="Times New Roman" w:hAnsi="Symbol" w:cs="Times New Roman"/>
-          <w:sz w:val="20"/>
-          <w:szCs w:val="20"/>
-        </w:rPr>
-        <w:t xml:space="preserve">      </w:t>
-      </w:r>
-      <w:r>
-        <w:rPr>
-          <w:rFonts w:ascii="Times New Roman" w:eastAsia="Times New Roman" w:hAnsi="Symbol" w:cs="Times New Roman"/>
-          <w:sz w:val="20"/>
-          <w:szCs w:val="20"/>
-        </w:rPr>
-        <w:t></w:t>
-      </w:r>
-      <w:r>
-        <w:rPr>
-          <w:rFonts w:ascii="Times New Roman" w:eastAsia="Times New Roman" w:hAnsi="Times New Roman" w:cs="Times New Roman"/>
-          <w:sz w:val="20"/>
-          <w:szCs w:val="20"/>
-        </w:rPr>
-        <w:t xml:space="preserve">     </w:t>
-      </w:r>
-      <w:r>
-        <w:rPr>
-          <w:rFonts w:ascii="Times New Roman" w:eastAsia="Times New Roman" w:hAnsi="Times New Roman" w:cs="Times New Roman"/>
-          <w:sz w:val="20"/>
-          <w:szCs w:val="20"/>
-        </w:rPr>
-        <w:t>Boosted staff productivity ~40%, slashed processing time, and improved traceability with audit logs and document capture.</w:t>
-      </w:r>
-    </w:p>
-    <w:p>
-      <w:pPr>
-        <w:pStyle w:val="NormalWeb"/>
-        <w:spacing w:before="0" w:beforeAutospacing="0" w:after="0" w:afterAutospacing="0"/>
-        <w:rPr>
-          <w:b/>
-          <w:bCs/>
-          <w:sz w:val="20"/>
-          <w:szCs w:val="20"/>
-        </w:rPr>
-      </w:pPr>
-      <w:proofErr w:type="spellStart"/>
-      <w:r>
-        <w:rPr>
-          <w:rStyle w:val="Strong"/>
-          <w:sz w:val="20"/>
-          <w:szCs w:val="20"/>
-        </w:rPr>
-        <w:t>SecureCalc</w:t>
-      </w:r>
-      <w:proofErr w:type="spellEnd"/>
-      <w:r>
-        <w:rPr>
-          <w:rStyle w:val="Strong"/>
-          <w:sz w:val="20"/>
-          <w:szCs w:val="20"/>
-        </w:rPr>
-        <w:t xml:space="preserve"> (Flask, OOP / Modular Design</w:t>
-      </w:r>
-      <w:r>
-        <w:rPr>
-          <w:rStyle w:val="Strong"/>
-          <w:sz w:val="20"/>
-          <w:szCs w:val="20"/>
-        </w:rPr>
-        <w:t xml:space="preserve"> |Duration: 1 M</w:t>
-      </w:r>
-      <w:r>
-        <w:rPr>
-          <w:rStyle w:val="Strong"/>
-          <w:sz w:val="20"/>
-          <w:szCs w:val="20"/>
-        </w:rPr>
-        <w:t>onth</w:t>
-      </w:r>
-    </w:p>
-    <w:p>
-      <w:pPr>
+        <w:pStyle w:val="ListParagraph"/>
         <w:numPr>
           <w:ilvl w:val="0"/>
-          <w:numId w:val="6"/>
+          <w:numId w:val="10"/>
         </w:numPr>
         <w:spacing w:before="100" w:beforeAutospacing="1" w:after="100" w:afterAutospacing="1" w:line="240" w:lineRule="auto"/>
         <w:rPr>
@@ -1152,32 +1079,15 @@
           <w:sz w:val="20"/>
           <w:szCs w:val="20"/>
         </w:rPr>
-        <w:t xml:space="preserve">, min/max, </w:t>
-      </w:r>
-      <w:proofErr w:type="gramStart"/>
-      <w:r>
-        <w:rPr>
-          <w:rFonts w:ascii="Times New Roman" w:eastAsia="Times New Roman" w:hAnsi="Times New Roman" w:cs="Times New Roman"/>
-          <w:sz w:val="20"/>
-          <w:szCs w:val="20"/>
-        </w:rPr>
-        <w:t>remainder</w:t>
-      </w:r>
-      <w:proofErr w:type="gramEnd"/>
-      <w:r>
-        <w:rPr>
-          <w:rFonts w:ascii="Times New Roman" w:eastAsia="Times New Roman" w:hAnsi="Times New Roman" w:cs="Times New Roman"/>
-          <w:sz w:val="20"/>
-          <w:szCs w:val="20"/>
-        </w:rPr>
-        <w:t>) in modal pop-ups.</w:t>
-      </w:r>
-    </w:p>
-    <w:p>
-      <w:pPr>
+        <w:t>, min/max, remainder) in modal pop-ups.</w:t>
+      </w:r>
+    </w:p>
+    <w:p>
+      <w:pPr>
+        <w:pStyle w:val="ListParagraph"/>
         <w:numPr>
           <w:ilvl w:val="0"/>
-          <w:numId w:val="6"/>
+          <w:numId w:val="10"/>
         </w:numPr>
         <w:spacing w:before="100" w:beforeAutospacing="1" w:after="100" w:afterAutospacing="1" w:line="240" w:lineRule="auto"/>
         <w:rPr>
@@ -1197,9 +1107,10 @@
     </w:p>
     <w:p>
       <w:pPr>
+        <w:pStyle w:val="ListParagraph"/>
         <w:numPr>
           <w:ilvl w:val="0"/>
-          <w:numId w:val="6"/>
+          <w:numId w:val="10"/>
         </w:numPr>
         <w:spacing w:before="100" w:beforeAutospacing="1" w:after="100" w:afterAutospacing="1" w:line="240" w:lineRule="auto"/>
         <w:rPr>
@@ -1219,9 +1130,10 @@
     </w:p>
     <w:p>
       <w:pPr>
+        <w:pStyle w:val="ListParagraph"/>
         <w:numPr>
           <w:ilvl w:val="0"/>
-          <w:numId w:val="6"/>
+          <w:numId w:val="10"/>
         </w:numPr>
         <w:spacing w:before="100" w:beforeAutospacing="1" w:after="100" w:afterAutospacing="1" w:line="240" w:lineRule="auto"/>
         <w:rPr>
@@ -1300,13 +1212,55 @@
         </w:rPr>
         <w:t xml:space="preserve"> 1 Month</w:t>
       </w:r>
+      <w:r>
+        <w:rPr>
+          <w:b/>
+          <w:bCs/>
+          <w:sz w:val="20"/>
+          <w:szCs w:val="20"/>
+        </w:rPr>
+        <w:t xml:space="preserve"> | </w:t>
+      </w:r>
+      <w:hyperlink r:id="rId12" w:history="1">
+        <w:r>
+          <w:rPr>
+            <w:rStyle w:val="Hyperlink"/>
+            <w:b/>
+            <w:bCs/>
+            <w:sz w:val="20"/>
+            <w:szCs w:val="20"/>
+          </w:rPr>
+          <w:t>GitHub Repository Link</w:t>
+        </w:r>
+      </w:hyperlink>
+      <w:r>
+        <w:rPr>
+          <w:b/>
+          <w:bCs/>
+          <w:sz w:val="20"/>
+          <w:szCs w:val="20"/>
+        </w:rPr>
+        <w:t xml:space="preserve"> &amp; </w:t>
+      </w:r>
+      <w:hyperlink r:id="rId13" w:history="1">
+        <w:r>
+          <w:rPr>
+            <w:rStyle w:val="Hyperlink"/>
+            <w:b/>
+            <w:bCs/>
+            <w:sz w:val="20"/>
+            <w:szCs w:val="20"/>
+          </w:rPr>
+          <w:t>Deployed Site</w:t>
+        </w:r>
+      </w:hyperlink>
     </w:p>
     <w:p>
       <w:pPr>
         <w:pStyle w:val="ListParagraph"/>
         <w:numPr>
           <w:ilvl w:val="0"/>
-          <w:numId w:val="7"/>
+          <w:numId w:val="11"/>
         </w:numPr>
         <w:spacing w:before="100" w:beforeAutospacing="1" w:after="100" w:afterAutospacing="1" w:line="240" w:lineRule="auto"/>
         <w:rPr>
@@ -1329,7 +1283,7 @@
         <w:pStyle w:val="ListParagraph"/>
         <w:numPr>
           <w:ilvl w:val="0"/>
-          <w:numId w:val="7"/>
+          <w:numId w:val="11"/>
         </w:numPr>
         <w:spacing w:before="100" w:beforeAutospacing="1" w:after="100" w:afterAutospacing="1" w:line="240" w:lineRule="auto"/>
         <w:rPr>
@@ -1352,7 +1306,7 @@
         <w:pStyle w:val="ListParagraph"/>
         <w:numPr>
           <w:ilvl w:val="0"/>
-          <w:numId w:val="7"/>
+          <w:numId w:val="11"/>
         </w:numPr>
         <w:spacing w:before="100" w:beforeAutospacing="1" w:after="100" w:afterAutospacing="1" w:line="240" w:lineRule="auto"/>
         <w:rPr>
@@ -1375,7 +1329,7 @@
         <w:pStyle w:val="ListParagraph"/>
         <w:numPr>
           <w:ilvl w:val="0"/>
-          <w:numId w:val="7"/>
+          <w:numId w:val="11"/>
         </w:numPr>
         <w:spacing w:before="100" w:beforeAutospacing="1" w:after="100" w:afterAutospacing="1" w:line="240" w:lineRule="auto"/>
         <w:rPr>
@@ -1461,6 +1415,27 @@
         </w:rPr>
         <w:t xml:space="preserve"> 2 Months</w:t>
       </w:r>
+      <w:r>
+        <w:rPr>
+          <w:b/>
+          <w:bCs/>
+          <w:sz w:val="20"/>
+          <w:szCs w:val="20"/>
+        </w:rPr>
+        <w:t xml:space="preserve"> | </w:t>
+      </w:r>
+      <w:hyperlink r:id="rId14" w:history="1">
+        <w:r>
+          <w:rPr>
+            <w:rStyle w:val="Hyperlink"/>
+            <w:b/>
+            <w:bCs/>
+            <w:sz w:val="20"/>
+            <w:szCs w:val="20"/>
+          </w:rPr>
+          <w:t>GitHub Repository Link</w:t>
+        </w:r>
+      </w:hyperlink>
     </w:p>
     <w:p>
       <w:pPr>
@@ -1627,6 +1602,27 @@
         </w:rPr>
         <w:t>1 Month</w:t>
       </w:r>
+      <w:r>
+        <w:rPr>
+          <w:b/>
+          <w:bCs/>
+          <w:sz w:val="20"/>
+          <w:szCs w:val="20"/>
+        </w:rPr>
+        <w:t xml:space="preserve"> |</w:t>
+      </w:r>
+      <w:hyperlink r:id="rId15" w:history="1">
+        <w:r>
+          <w:rPr>
+            <w:rStyle w:val="Hyperlink"/>
+            <w:b/>
+            <w:bCs/>
+            <w:sz w:val="20"/>
+            <w:szCs w:val="20"/>
+          </w:rPr>
+          <w:t>GitHub Repository Link</w:t>
+        </w:r>
+      </w:hyperlink>
     </w:p>
     <w:p>
       <w:pPr>
@@ -1878,15 +1874,8 @@
           <w:szCs w:val="20"/>
         </w:rPr>
       </w:pPr>
-    </w:p>
-    <w:p>
-      <w:pPr>
-        <w:spacing w:after="0" w:line="240" w:lineRule="auto"/>
-        <w:rPr>
-          <w:sz w:val="20"/>
-          <w:szCs w:val="20"/>
-        </w:rPr>
-      </w:pPr>
+      <w:bookmarkStart w:id="0" w:name="_GoBack"/>
+      <w:bookmarkEnd w:id="0"/>
     </w:p>
     <w:sectPr>
       <w:pgSz w:w="12240" w:h="15840"/>
@@ -1901,6 +1890,119 @@
 <file path=word/numbering.xml><?xml version="1.0" encoding="utf-8"?>
 <w:numbering xmlns:wpc="http://schemas.microsoft.com/office/word/2010/wordprocessingCanvas" xmlns:mc="http://schemas.openxmlformats.org/markup-compatibility/2006" xmlns:o="urn:schemas-microsoft-com:office:office" xmlns:r="http://schemas.openxmlformats.org/officeDocument/2006/relationships" xmlns:m="http://schemas.openxmlformats.org/officeDocument/2006/math" xmlns:v="urn:schemas-microsoft-com:vml" xmlns:wp14="http://schemas.microsoft.com/office/word/2010/wordprocessingDrawing" xmlns:wp="http://schemas.openxmlformats.org/drawingml/2006/wordprocessingDrawing" xmlns:w10="urn:schemas-microsoft-com:office:word" xmlns:w="http://schemas.openxmlformats.org/wordprocessingml/2006/main" xmlns:w14="http://schemas.microsoft.com/office/word/2010/wordml" xmlns:wpg="http://schemas.microsoft.com/office/word/2010/wordprocessingGroup" xmlns:wpi="http://schemas.microsoft.com/office/word/2010/wordprocessingInk" xmlns:wne="http://schemas.microsoft.com/office/word/2006/wordml" xmlns:wps="http://schemas.microsoft.com/office/word/2010/wordprocessingShape" mc:Ignorable="w14 wp14">
   <w:abstractNum w:abstractNumId="0">
+    <w:nsid w:val="18745129"/>
+    <w:multiLevelType w:val="hybridMultilevel"/>
+    <w:tmpl w:val="CADE2ED4"/>
+    <w:lvl w:ilvl="0" w:tplc="04090001">
+      <w:start w:val="1"/>
+      <w:numFmt w:val="bullet"/>
+      <w:lvlText w:val=""/>
+      <w:lvlJc w:val="left"/>
+      <w:pPr>
+        <w:ind w:left="720" w:hanging="360"/>
+      </w:pPr>
+      <w:rPr>
+        <w:rFonts w:ascii="Symbol" w:hAnsi="Symbol" w:hint="default"/>
+      </w:rPr>
+    </w:lvl>
+    <w:lvl w:ilvl="1" w:tplc="04090003" w:tentative="1">
+      <w:start w:val="1"/>
+      <w:numFmt w:val="bullet"/>
+      <w:lvlText w:val="o"/>
+      <w:lvlJc w:val="left"/>
+      <w:pPr>
+        <w:ind w:left="1440" w:hanging="360"/>
+      </w:pPr>
+      <w:rPr>
+        <w:rFonts w:ascii="Courier New" w:hAnsi="Courier New" w:cs="Courier New" w:hint="default"/>
+      </w:rPr>
+    </w:lvl>
+    <w:lvl w:ilvl="2" w:tplc="04090005" w:tentative="1">
+      <w:start w:val="1"/>
+      <w:numFmt w:val="bullet"/>
+      <w:lvlText w:val=""/>
+      <w:lvlJc w:val="left"/>
+      <w:pPr>
+        <w:ind w:left="2160" w:hanging="360"/>
+      </w:pPr>
+      <w:rPr>
+        <w:rFonts w:ascii="Wingdings" w:hAnsi="Wingdings" w:hint="default"/>
+      </w:rPr>
+    </w:lvl>
+    <w:lvl w:ilvl="3" w:tplc="04090001" w:tentative="1">
+      <w:start w:val="1"/>
+      <w:numFmt w:val="bullet"/>
+      <w:lvlText w:val=""/>
+      <w:lvlJc w:val="left"/>
+      <w:pPr>
+        <w:ind w:left="2880" w:hanging="360"/>
+      </w:pPr>
+      <w:rPr>
+        <w:rFonts w:ascii="Symbol" w:hAnsi="Symbol" w:hint="default"/>
+      </w:rPr>
+    </w:lvl>
+    <w:lvl w:ilvl="4" w:tplc="04090003" w:tentative="1">
+      <w:start w:val="1"/>
+      <w:numFmt w:val="bullet"/>
+      <w:lvlText w:val="o"/>
+      <w:lvlJc w:val="left"/>
+      <w:pPr>
+        <w:ind w:left="3600" w:hanging="360"/>
+      </w:pPr>
+      <w:rPr>
+        <w:rFonts w:ascii="Courier New" w:hAnsi="Courier New" w:cs="Courier New" w:hint="default"/>
+      </w:rPr>
+    </w:lvl>
+    <w:lvl w:ilvl="5" w:tplc="04090005" w:tentative="1">
+      <w:start w:val="1"/>
+      <w:numFmt w:val="bullet"/>
+      <w:lvlText w:val=""/>
+      <w:lvlJc w:val="left"/>
+      <w:pPr>
+        <w:ind w:left="4320" w:hanging="360"/>
+      </w:pPr>
+      <w:rPr>
+        <w:rFonts w:ascii="Wingdings" w:hAnsi="Wingdings" w:hint="default"/>
+      </w:rPr>
+    </w:lvl>
+    <w:lvl w:ilvl="6" w:tplc="04090001" w:tentative="1">
+      <w:start w:val="1"/>
+      <w:numFmt w:val="bullet"/>
+      <w:lvlText w:val=""/>
+      <w:lvlJc w:val="left"/>
+      <w:pPr>
+        <w:ind w:left="5040" w:hanging="360"/>
+      </w:pPr>
+      <w:rPr>
+        <w:rFonts w:ascii="Symbol" w:hAnsi="Symbol" w:hint="default"/>
+      </w:rPr>
+    </w:lvl>
+    <w:lvl w:ilvl="7" w:tplc="04090003" w:tentative="1">
+      <w:start w:val="1"/>
+      <w:numFmt w:val="bullet"/>
+      <w:lvlText w:val="o"/>
+      <w:lvlJc w:val="left"/>
+      <w:pPr>
+        <w:ind w:left="5760" w:hanging="360"/>
+      </w:pPr>
+      <w:rPr>
+        <w:rFonts w:ascii="Courier New" w:hAnsi="Courier New" w:cs="Courier New" w:hint="default"/>
+      </w:rPr>
+    </w:lvl>
+    <w:lvl w:ilvl="8" w:tplc="04090005" w:tentative="1">
+      <w:start w:val="1"/>
+      <w:numFmt w:val="bullet"/>
+      <w:lvlText w:val=""/>
+      <w:lvlJc w:val="left"/>
+      <w:pPr>
+        <w:ind w:left="6480" w:hanging="360"/>
+      </w:pPr>
+      <w:rPr>
+        <w:rFonts w:ascii="Wingdings" w:hAnsi="Wingdings" w:hint="default"/>
+      </w:rPr>
+    </w:lvl>
+  </w:abstractNum>
+  <w:abstractNum w:abstractNumId="1">
     <w:nsid w:val="220A20EC"/>
     <w:multiLevelType w:val="multilevel"/>
     <w:tmpl w:val="7D4E937E"/>
@@ -2049,7 +2151,7 @@
       </w:rPr>
     </w:lvl>
   </w:abstractNum>
-  <w:abstractNum w:abstractNumId="1">
+  <w:abstractNum w:abstractNumId="2">
     <w:nsid w:val="30DD54DF"/>
     <w:multiLevelType w:val="multilevel"/>
     <w:tmpl w:val="8B1671C8"/>
@@ -2198,7 +2300,7 @@
       </w:rPr>
     </w:lvl>
   </w:abstractNum>
-  <w:abstractNum w:abstractNumId="2">
+  <w:abstractNum w:abstractNumId="3">
     <w:nsid w:val="310428E7"/>
     <w:multiLevelType w:val="hybridMultilevel"/>
     <w:tmpl w:val="BFCA27F4"/>
@@ -2311,7 +2413,120 @@
       </w:rPr>
     </w:lvl>
   </w:abstractNum>
-  <w:abstractNum w:abstractNumId="3">
+  <w:abstractNum w:abstractNumId="4">
+    <w:nsid w:val="34FF6A5D"/>
+    <w:multiLevelType w:val="hybridMultilevel"/>
+    <w:tmpl w:val="94588E4A"/>
+    <w:lvl w:ilvl="0" w:tplc="04090001">
+      <w:start w:val="1"/>
+      <w:numFmt w:val="bullet"/>
+      <w:lvlText w:val=""/>
+      <w:lvlJc w:val="left"/>
+      <w:pPr>
+        <w:ind w:left="720" w:hanging="360"/>
+      </w:pPr>
+      <w:rPr>
+        <w:rFonts w:ascii="Symbol" w:hAnsi="Symbol" w:hint="default"/>
+      </w:rPr>
+    </w:lvl>
+    <w:lvl w:ilvl="1" w:tplc="04090003" w:tentative="1">
+      <w:start w:val="1"/>
+      <w:numFmt w:val="bullet"/>
+      <w:lvlText w:val="o"/>
+      <w:lvlJc w:val="left"/>
+      <w:pPr>
+        <w:ind w:left="1440" w:hanging="360"/>
+      </w:pPr>
+      <w:rPr>
+        <w:rFonts w:ascii="Courier New" w:hAnsi="Courier New" w:cs="Courier New" w:hint="default"/>
+      </w:rPr>
+    </w:lvl>
+    <w:lvl w:ilvl="2" w:tplc="04090005" w:tentative="1">
+      <w:start w:val="1"/>
+      <w:numFmt w:val="bullet"/>
+      <w:lvlText w:val=""/>
+      <w:lvlJc w:val="left"/>
+      <w:pPr>
+        <w:ind w:left="2160" w:hanging="360"/>
+      </w:pPr>
+      <w:rPr>
+        <w:rFonts w:ascii="Wingdings" w:hAnsi="Wingdings" w:hint="default"/>
+      </w:rPr>
+    </w:lvl>
+    <w:lvl w:ilvl="3" w:tplc="04090001" w:tentative="1">
+      <w:start w:val="1"/>
+      <w:numFmt w:val="bullet"/>
+      <w:lvlText w:val=""/>
+      <w:lvlJc w:val="left"/>
+      <w:pPr>
+        <w:ind w:left="2880" w:hanging="360"/>
+      </w:pPr>
+      <w:rPr>
+        <w:rFonts w:ascii="Symbol" w:hAnsi="Symbol" w:hint="default"/>
+      </w:rPr>
+    </w:lvl>
+    <w:lvl w:ilvl="4" w:tplc="04090003" w:tentative="1">
+      <w:start w:val="1"/>
+      <w:numFmt w:val="bullet"/>
+      <w:lvlText w:val="o"/>
+      <w:lvlJc w:val="left"/>
+      <w:pPr>
+        <w:ind w:left="3600" w:hanging="360"/>
+      </w:pPr>
+      <w:rPr>
+        <w:rFonts w:ascii="Courier New" w:hAnsi="Courier New" w:cs="Courier New" w:hint="default"/>
+      </w:rPr>
+    </w:lvl>
+    <w:lvl w:ilvl="5" w:tplc="04090005" w:tentative="1">
+      <w:start w:val="1"/>
+      <w:numFmt w:val="bullet"/>
+      <w:lvlText w:val=""/>
+      <w:lvlJc w:val="left"/>
+      <w:pPr>
+        <w:ind w:left="4320" w:hanging="360"/>
+      </w:pPr>
+      <w:rPr>
+        <w:rFonts w:ascii="Wingdings" w:hAnsi="Wingdings" w:hint="default"/>
+      </w:rPr>
+    </w:lvl>
+    <w:lvl w:ilvl="6" w:tplc="04090001" w:tentative="1">
+      <w:start w:val="1"/>
+      <w:numFmt w:val="bullet"/>
+      <w:lvlText w:val=""/>
+      <w:lvlJc w:val="left"/>
+      <w:pPr>
+        <w:ind w:left="5040" w:hanging="360"/>
+      </w:pPr>
+      <w:rPr>
+        <w:rFonts w:ascii="Symbol" w:hAnsi="Symbol" w:hint="default"/>
+      </w:rPr>
+    </w:lvl>
+    <w:lvl w:ilvl="7" w:tplc="04090003" w:tentative="1">
+      <w:start w:val="1"/>
+      <w:numFmt w:val="bullet"/>
+      <w:lvlText w:val="o"/>
+      <w:lvlJc w:val="left"/>
+      <w:pPr>
+        <w:ind w:left="5760" w:hanging="360"/>
+      </w:pPr>
+      <w:rPr>
+        <w:rFonts w:ascii="Courier New" w:hAnsi="Courier New" w:cs="Courier New" w:hint="default"/>
+      </w:rPr>
+    </w:lvl>
+    <w:lvl w:ilvl="8" w:tplc="04090005" w:tentative="1">
+      <w:start w:val="1"/>
+      <w:numFmt w:val="bullet"/>
+      <w:lvlText w:val=""/>
+      <w:lvlJc w:val="left"/>
+      <w:pPr>
+        <w:ind w:left="6480" w:hanging="360"/>
+      </w:pPr>
+      <w:rPr>
+        <w:rFonts w:ascii="Wingdings" w:hAnsi="Wingdings" w:hint="default"/>
+      </w:rPr>
+    </w:lvl>
+  </w:abstractNum>
+  <w:abstractNum w:abstractNumId="5">
     <w:nsid w:val="4E501AE7"/>
     <w:multiLevelType w:val="multilevel"/>
     <w:tmpl w:val="AC4C8B4C"/>
@@ -2460,7 +2675,7 @@
       </w:rPr>
     </w:lvl>
   </w:abstractNum>
-  <w:abstractNum w:abstractNumId="4">
+  <w:abstractNum w:abstractNumId="6">
     <w:nsid w:val="533C683E"/>
     <w:multiLevelType w:val="hybridMultilevel"/>
     <w:tmpl w:val="CA4A0C96"/>
@@ -2573,7 +2788,7 @@
       </w:rPr>
     </w:lvl>
   </w:abstractNum>
-  <w:abstractNum w:abstractNumId="5">
+  <w:abstractNum w:abstractNumId="7">
     <w:nsid w:val="60991F1C"/>
     <w:multiLevelType w:val="hybridMultilevel"/>
     <w:tmpl w:val="7904F5A0"/>
@@ -2686,7 +2901,7 @@
       </w:rPr>
     </w:lvl>
   </w:abstractNum>
-  <w:abstractNum w:abstractNumId="6">
+  <w:abstractNum w:abstractNumId="8">
     <w:nsid w:val="61D91C2A"/>
     <w:multiLevelType w:val="multilevel"/>
     <w:tmpl w:val="35B49EDA"/>
@@ -2835,7 +3050,7 @@
       </w:rPr>
     </w:lvl>
   </w:abstractNum>
-  <w:abstractNum w:abstractNumId="7">
+  <w:abstractNum w:abstractNumId="9">
     <w:nsid w:val="63E1031F"/>
     <w:multiLevelType w:val="multilevel"/>
     <w:tmpl w:val="E606183E"/>
@@ -2984,7 +3199,7 @@
       </w:rPr>
     </w:lvl>
   </w:abstractNum>
-  <w:abstractNum w:abstractNumId="8">
+  <w:abstractNum w:abstractNumId="10">
     <w:nsid w:val="7667107D"/>
     <w:multiLevelType w:val="multilevel"/>
     <w:tmpl w:val="79064E94"/>
@@ -3134,31 +3349,37 @@
     </w:lvl>
   </w:abstractNum>
   <w:num w:numId="1">
+    <w:abstractNumId w:val="9"/>
+  </w:num>
+  <w:num w:numId="2">
+    <w:abstractNumId w:val="5"/>
+  </w:num>
+  <w:num w:numId="3">
+    <w:abstractNumId w:val="2"/>
+  </w:num>
+  <w:num w:numId="4">
+    <w:abstractNumId w:val="8"/>
+  </w:num>
+  <w:num w:numId="5">
+    <w:abstractNumId w:val="1"/>
+  </w:num>
+  <w:num w:numId="6">
+    <w:abstractNumId w:val="10"/>
+  </w:num>
+  <w:num w:numId="7">
     <w:abstractNumId w:val="7"/>
   </w:num>
-  <w:num w:numId="2">
+  <w:num w:numId="8">
+    <w:abstractNumId w:val="6"/>
+  </w:num>
+  <w:num w:numId="9">
     <w:abstractNumId w:val="3"/>
   </w:num>
-  <w:num w:numId="3">
-    <w:abstractNumId w:val="1"/>
-  </w:num>
-  <w:num w:numId="4">
-    <w:abstractNumId w:val="6"/>
-  </w:num>
-  <w:num w:numId="5">
-    <w:abstractNumId w:val="0"/>
-  </w:num>
-  <w:num w:numId="6">
-    <w:abstractNumId w:val="8"/>
-  </w:num>
-  <w:num w:numId="7">
-    <w:abstractNumId w:val="5"/>
-  </w:num>
-  <w:num w:numId="8">
+  <w:num w:numId="10">
     <w:abstractNumId w:val="4"/>
   </w:num>
-  <w:num w:numId="9">
-    <w:abstractNumId w:val="2"/>
+  <w:num w:numId="11">
+    <w:abstractNumId w:val="0"/>
   </w:num>
 </w:numbering>
 </file>

</xml_diff>